<commit_message>
Generate the reviewer roster document instead of hand-editing it
The roster document was produced by an ad-hoc script that was never
saved, so resolving the three countries meant patching it by hand, and
the patch missed: three rows kept reading "not recorded" while the CSV
beside them said Canada and US. It drifted inside a single turn.

build_reviewer_roster_doc.py renders the document from the CSV, checks
its own headline figures against /api/panel-stats, and exits non-zero if
any disagree. The city-qualifier normalization travels with it.

Co-Authored-By: Claude Opus 5 <noreply@anthropic.com>
Claude-Session: https://claude.ai/code/session_01W9UtE7X76spacWeSvBH7tv
</commit_message>
<xml_diff>
--- a/research/REVIEWER_ROSTER_COMPLETE.docx
+++ b/research/REVIEWER_ROSTER_COMPLETE.docx
@@ -19,7 +19,7 @@
         <w:rPr>
           <w:b/>
         </w:rPr>
-        <w:t xml:space="preserve">Every person who has graded records for JRS, across all three studies. Built 2026-08-13 by `research/build_expert_roster.py`, with completion re-verified live against `pilot_progress` and `armb_progress` on this run.</w:t>
+        <w:t xml:space="preserve">Every person who has graded records for JRS, across all three studies. Generated by `research/build_reviewer_roster_doc.py` from the roster CSV, with completion re-verified live on the build that produced it.</w:t>
       </w:r>
     </w:p>
     <w:p>
@@ -60,7 +60,7 @@
         <w:t xml:space="preserve">research/PARTICIPANT_INVENTORY_BY_RUNG.md</w:t>
       </w:r>
       <w:r>
-        <w:t xml:space="preserve">. Both files read the same CSV for their human rows, so they cannot disagree about a person.</w:t>
+        <w:t xml:space="preserve">. Both files read the same CSV, so they cannot disagree about a person.</w:t>
       </w:r>
     </w:p>
     <w:p>
@@ -383,7 +383,7 @@
         <w:rPr>
           <w:b/>
         </w:rPr>
-        <w:t xml:space="preserve">The 16-country figure belongs to the 36 completers, never to the 58 reviewers.</w:t>
+        <w:t xml:space="preserve">The country figure belongs to the 36 completers, never to the 58 reviewers.</w:t>
       </w:r>
       <w:r>
         <w:t xml:space="preserve"> That is a recorded past defect and it still binds.</w:t>
@@ -3935,7 +3935,7 @@
               <w:spacing w:after="0"/>
             </w:pPr>
             <w:r>
-              <w:t xml:space="preserve">not recorded</w:t>
+              <w:t xml:space="preserve">Canada</w:t>
             </w:r>
           </w:p>
         </w:tc>
@@ -4034,7 +4034,7 @@
               <w:spacing w:after="0"/>
             </w:pPr>
             <w:r>
-              <w:t xml:space="preserve">not recorded</w:t>
+              <w:t xml:space="preserve">US</w:t>
             </w:r>
           </w:p>
         </w:tc>
@@ -4133,7 +4133,7 @@
               <w:spacing w:after="0"/>
             </w:pPr>
             <w:r>
-              <w:t xml:space="preserve">not recorded</w:t>
+              <w:t xml:space="preserve">US</w:t>
             </w:r>
           </w:p>
         </w:tc>
@@ -4407,6 +4407,9 @@
               <w:spacing w:after="0"/>
             </w:pPr>
             <w:r>
+              <w:rPr>
+                <w:i/>
+              </w:rPr>
               <w:t xml:space="preserve">not recorded</w:t>
             </w:r>
           </w:p>
@@ -4506,6 +4509,9 @@
               <w:spacing w:after="0"/>
             </w:pPr>
             <w:r>
+              <w:rPr>
+                <w:i/>
+              </w:rPr>
               <w:t xml:space="preserve">not recorded</w:t>
             </w:r>
           </w:p>
@@ -4605,6 +4611,9 @@
               <w:spacing w:after="0"/>
             </w:pPr>
             <w:r>
+              <w:rPr>
+                <w:i/>
+              </w:rPr>
               <w:t xml:space="preserve">not recorded</w:t>
             </w:r>
           </w:p>
@@ -4704,6 +4713,9 @@
               <w:spacing w:after="0"/>
             </w:pPr>
             <w:r>
+              <w:rPr>
+                <w:i/>
+              </w:rPr>
               <w:t xml:space="preserve">not recorded</w:t>
             </w:r>
           </w:p>
@@ -4803,6 +4815,9 @@
               <w:spacing w:after="0"/>
             </w:pPr>
             <w:r>
+              <w:rPr>
+                <w:i/>
+              </w:rPr>
               <w:t xml:space="preserve">not recorded</w:t>
             </w:r>
           </w:p>
@@ -4902,6 +4917,9 @@
               <w:spacing w:after="0"/>
             </w:pPr>
             <w:r>
+              <w:rPr>
+                <w:i/>
+              </w:rPr>
               <w:t xml:space="preserve">not recorded</w:t>
             </w:r>
           </w:p>
@@ -5001,6 +5019,9 @@
               <w:spacing w:after="0"/>
             </w:pPr>
             <w:r>
+              <w:rPr>
+                <w:i/>
+              </w:rPr>
               <w:t xml:space="preserve">not recorded</w:t>
             </w:r>
           </w:p>
@@ -5100,6 +5121,9 @@
               <w:spacing w:after="0"/>
             </w:pPr>
             <w:r>
+              <w:rPr>
+                <w:i/>
+              </w:rPr>
               <w:t xml:space="preserve">not recorded</w:t>
             </w:r>
           </w:p>
@@ -5199,6 +5223,9 @@
               <w:spacing w:after="0"/>
             </w:pPr>
             <w:r>
+              <w:rPr>
+                <w:i/>
+              </w:rPr>
               <w:t xml:space="preserve">not recorded</w:t>
             </w:r>
           </w:p>
@@ -5298,6 +5325,9 @@
               <w:spacing w:after="0"/>
             </w:pPr>
             <w:r>
+              <w:rPr>
+                <w:i/>
+              </w:rPr>
               <w:t xml:space="preserve">not recorded</w:t>
             </w:r>
           </w:p>
@@ -5397,6 +5427,9 @@
               <w:spacing w:after="0"/>
             </w:pPr>
             <w:r>
+              <w:rPr>
+                <w:i/>
+              </w:rPr>
               <w:t xml:space="preserve">not recorded</w:t>
             </w:r>
           </w:p>
@@ -5496,6 +5529,9 @@
               <w:spacing w:after="0"/>
             </w:pPr>
             <w:r>
+              <w:rPr>
+                <w:i/>
+              </w:rPr>
               <w:t xml:space="preserve">not recorded</w:t>
             </w:r>
           </w:p>
@@ -5595,6 +5631,9 @@
               <w:spacing w:after="0"/>
             </w:pPr>
             <w:r>
+              <w:rPr>
+                <w:i/>
+              </w:rPr>
               <w:t xml:space="preserve">not recorded</w:t>
             </w:r>
           </w:p>
@@ -5694,6 +5733,9 @@
               <w:spacing w:after="0"/>
             </w:pPr>
             <w:r>
+              <w:rPr>
+                <w:i/>
+              </w:rPr>
               <w:t xml:space="preserve">not recorded</w:t>
             </w:r>
           </w:p>
@@ -5793,6 +5835,9 @@
               <w:spacing w:after="0"/>
             </w:pPr>
             <w:r>
+              <w:rPr>
+                <w:i/>
+              </w:rPr>
               <w:t xml:space="preserve">not recorded</w:t>
             </w:r>
           </w:p>
@@ -5892,6 +5937,9 @@
               <w:spacing w:after="0"/>
             </w:pPr>
             <w:r>
+              <w:rPr>
+                <w:i/>
+              </w:rPr>
               <w:t xml:space="preserve">not recorded</w:t>
             </w:r>
           </w:p>
@@ -5991,6 +6039,9 @@
               <w:spacing w:after="0"/>
             </w:pPr>
             <w:r>
+              <w:rPr>
+                <w:i/>
+              </w:rPr>
               <w:t xml:space="preserve">not recorded</w:t>
             </w:r>
           </w:p>
@@ -6087,6 +6138,9 @@
               <w:spacing w:after="0"/>
             </w:pPr>
             <w:r>
+              <w:rPr>
+                <w:i/>
+              </w:rPr>
               <w:t xml:space="preserve">not recorded</w:t>
             </w:r>
           </w:p>
@@ -6474,6 +6528,9 @@
               <w:spacing w:after="0"/>
             </w:pPr>
             <w:r>
+              <w:rPr>
+                <w:i/>
+              </w:rPr>
               <w:t xml:space="preserve">not recorded</w:t>
             </w:r>
           </w:p>
@@ -6899,6 +6956,34 @@
               <w:spacing w:after="0"/>
             </w:pPr>
             <w:r>
+              <w:t xml:space="preserve">US</w:t>
+            </w:r>
+          </w:p>
+        </w:tc>
+        <w:tc>
+          <w:tcPr>
+            <w:tcW w:w="4680" w:type="dxa"/>
+          </w:tcPr>
+          <w:p>
+            <w:pPr>
+              <w:spacing w:after="0"/>
+            </w:pPr>
+            <w:r>
+              <w:t xml:space="preserve">6</w:t>
+            </w:r>
+          </w:p>
+        </w:tc>
+      </w:tr>
+      <w:tr>
+        <w:tc>
+          <w:tcPr>
+            <w:tcW w:w="4680" w:type="dxa"/>
+          </w:tcPr>
+          <w:p>
+            <w:pPr>
+              <w:spacing w:after="0"/>
+            </w:pPr>
+            <w:r>
               <w:t xml:space="preserve">Canada</w:t>
             </w:r>
           </w:p>
@@ -6912,6 +6997,34 @@
               <w:spacing w:after="0"/>
             </w:pPr>
             <w:r>
+              <w:t xml:space="preserve">5</w:t>
+            </w:r>
+          </w:p>
+        </w:tc>
+      </w:tr>
+      <w:tr>
+        <w:tc>
+          <w:tcPr>
+            <w:tcW w:w="4680" w:type="dxa"/>
+          </w:tcPr>
+          <w:p>
+            <w:pPr>
+              <w:spacing w:after="0"/>
+            </w:pPr>
+            <w:r>
+              <w:t xml:space="preserve">India</w:t>
+            </w:r>
+          </w:p>
+        </w:tc>
+        <w:tc>
+          <w:tcPr>
+            <w:tcW w:w="4680" w:type="dxa"/>
+          </w:tcPr>
+          <w:p>
+            <w:pPr>
+              <w:spacing w:after="0"/>
+            </w:pPr>
+            <w:r>
               <w:t xml:space="preserve">4</w:t>
             </w:r>
           </w:p>
@@ -6927,7 +7040,7 @@
               <w:spacing w:after="0"/>
             </w:pPr>
             <w:r>
-              <w:t xml:space="preserve">India</w:t>
+              <w:t xml:space="preserve">Nigeria</w:t>
             </w:r>
           </w:p>
         </w:tc>
@@ -6940,7 +7053,7 @@
               <w:spacing w:after="0"/>
             </w:pPr>
             <w:r>
-              <w:t xml:space="preserve">4</w:t>
+              <w:t xml:space="preserve">2</w:t>
             </w:r>
           </w:p>
         </w:tc>
@@ -6955,7 +7068,7 @@
               <w:spacing w:after="0"/>
             </w:pPr>
             <w:r>
-              <w:t xml:space="preserve">US</w:t>
+              <w:t xml:space="preserve">Poland</w:t>
             </w:r>
           </w:p>
         </w:tc>
@@ -6968,7 +7081,7 @@
               <w:spacing w:after="0"/>
             </w:pPr>
             <w:r>
-              <w:t xml:space="preserve">4</w:t>
+              <w:t xml:space="preserve">2</w:t>
             </w:r>
           </w:p>
         </w:tc>
@@ -6983,7 +7096,7 @@
               <w:spacing w:after="0"/>
             </w:pPr>
             <w:r>
-              <w:t xml:space="preserve">Nigeria</w:t>
+              <w:t xml:space="preserve">Singapore</w:t>
             </w:r>
           </w:p>
         </w:tc>
@@ -7011,7 +7124,7 @@
               <w:spacing w:after="0"/>
             </w:pPr>
             <w:r>
-              <w:t xml:space="preserve">Poland</w:t>
+              <w:t xml:space="preserve">Cote d'Ivoire</w:t>
             </w:r>
           </w:p>
         </w:tc>
@@ -7024,7 +7137,7 @@
               <w:spacing w:after="0"/>
             </w:pPr>
             <w:r>
-              <w:t xml:space="preserve">2</w:t>
+              <w:t xml:space="preserve">1</w:t>
             </w:r>
           </w:p>
         </w:tc>
@@ -7039,7 +7152,7 @@
               <w:spacing w:after="0"/>
             </w:pPr>
             <w:r>
-              <w:t xml:space="preserve">Singapore</w:t>
+              <w:t xml:space="preserve">Germany</w:t>
             </w:r>
           </w:p>
         </w:tc>
@@ -7052,7 +7165,7 @@
               <w:spacing w:after="0"/>
             </w:pPr>
             <w:r>
-              <w:t xml:space="preserve">2</w:t>
+              <w:t xml:space="preserve">1</w:t>
             </w:r>
           </w:p>
         </w:tc>
@@ -7067,7 +7180,7 @@
               <w:spacing w:after="0"/>
             </w:pPr>
             <w:r>
-              <w:t xml:space="preserve">Cote d'Ivoire</w:t>
+              <w:t xml:space="preserve">Iran</w:t>
             </w:r>
           </w:p>
         </w:tc>
@@ -7095,7 +7208,7 @@
               <w:spacing w:after="0"/>
             </w:pPr>
             <w:r>
-              <w:t xml:space="preserve">Germany</w:t>
+              <w:t xml:space="preserve">Kenya</w:t>
             </w:r>
           </w:p>
         </w:tc>
@@ -7123,7 +7236,7 @@
               <w:spacing w:after="0"/>
             </w:pPr>
             <w:r>
-              <w:t xml:space="preserve">Iran</w:t>
+              <w:t xml:space="preserve">South Africa</w:t>
             </w:r>
           </w:p>
         </w:tc>
@@ -7151,7 +7264,7 @@
               <w:spacing w:after="0"/>
             </w:pPr>
             <w:r>
-              <w:t xml:space="preserve">Kenya</w:t>
+              <w:t xml:space="preserve">South Korea</w:t>
             </w:r>
           </w:p>
         </w:tc>
@@ -7179,7 +7292,7 @@
               <w:spacing w:after="0"/>
             </w:pPr>
             <w:r>
-              <w:t xml:space="preserve">South Africa</w:t>
+              <w:t xml:space="preserve">Spain</w:t>
             </w:r>
           </w:p>
         </w:tc>
@@ -7207,7 +7320,7 @@
               <w:spacing w:after="0"/>
             </w:pPr>
             <w:r>
-              <w:t xml:space="preserve">South Korea</w:t>
+              <w:t xml:space="preserve">UAE</w:t>
             </w:r>
           </w:p>
         </w:tc>
@@ -7235,7 +7348,7 @@
               <w:spacing w:after="0"/>
             </w:pPr>
             <w:r>
-              <w:t xml:space="preserve">Spain</w:t>
+              <w:t xml:space="preserve">UK</w:t>
             </w:r>
           </w:p>
         </w:tc>
@@ -7249,93 +7362,6 @@
             </w:pPr>
             <w:r>
               <w:t xml:space="preserve">1</w:t>
-            </w:r>
-          </w:p>
-        </w:tc>
-      </w:tr>
-      <w:tr>
-        <w:tc>
-          <w:tcPr>
-            <w:tcW w:w="4680" w:type="dxa"/>
-          </w:tcPr>
-          <w:p>
-            <w:pPr>
-              <w:spacing w:after="0"/>
-            </w:pPr>
-            <w:r>
-              <w:t xml:space="preserve">UAE</w:t>
-            </w:r>
-          </w:p>
-        </w:tc>
-        <w:tc>
-          <w:tcPr>
-            <w:tcW w:w="4680" w:type="dxa"/>
-          </w:tcPr>
-          <w:p>
-            <w:pPr>
-              <w:spacing w:after="0"/>
-            </w:pPr>
-            <w:r>
-              <w:t xml:space="preserve">1</w:t>
-            </w:r>
-          </w:p>
-        </w:tc>
-      </w:tr>
-      <w:tr>
-        <w:tc>
-          <w:tcPr>
-            <w:tcW w:w="4680" w:type="dxa"/>
-          </w:tcPr>
-          <w:p>
-            <w:pPr>
-              <w:spacing w:after="0"/>
-            </w:pPr>
-            <w:r>
-              <w:t xml:space="preserve">UK</w:t>
-            </w:r>
-          </w:p>
-        </w:tc>
-        <w:tc>
-          <w:tcPr>
-            <w:tcW w:w="4680" w:type="dxa"/>
-          </w:tcPr>
-          <w:p>
-            <w:pPr>
-              <w:spacing w:after="0"/>
-            </w:pPr>
-            <w:r>
-              <w:t xml:space="preserve">1</w:t>
-            </w:r>
-          </w:p>
-        </w:tc>
-      </w:tr>
-      <w:tr>
-        <w:tc>
-          <w:tcPr>
-            <w:tcW w:w="4680" w:type="dxa"/>
-          </w:tcPr>
-          <w:p>
-            <w:pPr>
-              <w:spacing w:after="0"/>
-            </w:pPr>
-            <w:r>
-              <w:rPr>
-                <w:i/>
-              </w:rPr>
-              <w:t xml:space="preserve">not recorded</w:t>
-            </w:r>
-          </w:p>
-        </w:tc>
-        <w:tc>
-          <w:tcPr>
-            <w:tcW w:w="4680" w:type="dxa"/>
-          </w:tcPr>
-          <w:p>
-            <w:pPr>
-              <w:spacing w:after="0"/>
-            </w:pPr>
-            <w:r>
-              <w:t xml:space="preserve">3</w:t>
             </w:r>
           </w:p>
         </w:tc>
@@ -7502,10 +7528,46 @@
         <w:rPr>
           <w:b/>
         </w:rPr>
-        <w:t xml:space="preserve">3 completers have no country on record.</w:t>
-      </w:r>
-      <w:r>
-        <w:t xml:space="preserve"> They are counted in the 36 and in no country.</w:t>
+        <w:t xml:space="preserve">Every completer has a country.</w:t>
+      </w:r>
+      <w:r>
+        <w:t xml:space="preserve"> The last three, </w:t>
+      </w:r>
+      <w:r>
+        <w:rPr>
+          <w:rFonts w:ascii="Consolas" w:hAnsi="Consolas"/>
+        </w:rPr>
+        <w:t xml:space="preserve">RR-129</w:t>
+      </w:r>
+      <w:r>
+        <w:t xml:space="preserve">, </w:t>
+      </w:r>
+      <w:r>
+        <w:rPr>
+          <w:rFonts w:ascii="Consolas" w:hAnsi="Consolas"/>
+        </w:rPr>
+        <w:t xml:space="preserve">RR-130</w:t>
+      </w:r>
+      <w:r>
+        <w:t xml:space="preserve"> and </w:t>
+      </w:r>
+      <w:r>
+        <w:rPr>
+          <w:rFonts w:ascii="Consolas" w:hAnsi="Consolas"/>
+        </w:rPr>
+        <w:t xml:space="preserve">RR-132</w:t>
+      </w:r>
+      <w:r>
+        <w:t xml:space="preserve">, were resolved on 2026-08-13 from the owner: Canada, US and US. </w:t>
+      </w:r>
+      <w:r>
+        <w:rPr>
+          <w:rFonts w:ascii="Consolas" w:hAnsi="Consolas"/>
+        </w:rPr>
+        <w:t xml:space="preserve">RR-129</w:t>
+      </w:r>
+      <w:r>
+        <w:t xml:space="preserve"> is corroborated by her public professional profile; the other two are owner-stated and not independently checkable, which is stated rather than implied.</w:t>
       </w:r>
     </w:p>
     <w:p>
@@ -7544,7 +7606,7 @@
         <w:rPr>
           <w:i/>
         </w:rPr>
-        <w:t xml:space="preserve">Source: `research/Expert_Roster_All_Studies_2026-08-06.csv` and `research/Study004_Raters_2026-08-06.csv`. The filenames carry the builder's fixed date constant; the completion data was re-verified live on 2026-08-13.</w:t>
+        <w:t xml:space="preserve">Generated from `Expert_Roster_All_Studies_2026-08-06.csv`. The filename carries the roster builder's fixed date constant; the completion data in it is re-verified on every roster build.</w:t>
       </w:r>
     </w:p>
     <w:sectPr>

</xml_diff>